<commit_message>
Add summary: Portland City Council Budget Work Session Forecast Update & Service Area Follow Up  04/08/26
</commit_message>
<xml_diff>
--- a/summaries/2026-04-09_Portland City Council Budget Work Session Forecast Update & Service Area Follow Up  040826_summary.docx
+++ b/summaries/2026-04-09_Portland City Council Budget Work Session Forecast Update & Service Area Follow Up  040826_summary.docx
@@ -173,7 +173,7 @@
                 <w:color w:val="404040"/>
                 <w:sz w:val="18"/>
               </w:rPr>
-              <w:t>2026-04-10 22:53 UTC</w:t>
+              <w:t>2026-04-13 14:44 UTC</w:t>
             </w:r>
           </w:p>
         </w:tc>
@@ -197,7 +197,7 @@
           <w:color w:val="404040"/>
           <w:sz w:val="20"/>
         </w:rPr>
-        <w:t>This 155-minute Housing and Permitting Committee session focused primarily on two major housing finance ordinances. The first item established Portland's implementation of the state's Moderate Income Revolving Loan Program (MIRL), a new financing tool using no-interest state funds to support housing for middle-income households earning 50-120% of area median income. The second and more substantial item was a supplemental budget ordinance allocating $56 million in previously unspent Portland Housing Bureau funds across prevention, stabilization, and housing development programs. Committee Chair Candace Avalos (District 1) emphasized the urgency of the housing crisis, with Vice Chair Mitch Green (District 4) and co-sponsors including Angelita Morillo (District 3) highlighting the need for both immediate crisis response and long-term structural solutions. The session featured extensive public testimony from housing advocates, service providers, and residents supporting the funding package, with particular emphasis on eviction prevention and social housing acquisition.</w:t>
+        <w:t>Portland City Council held a budget work session on April 9, 2026, focusing on the March forecast update and council priorities for the upcoming fiscal year 26-27 budget. City Economist Peter Holzman presented revenue forecast updates showing the city remains in a challenging financial position, with a $35.6 million ongoing cuts requirement and $15.1 million in one-time cuts needed to balance the budget. The forecast showed impacts from federal House Resolution 1 (the "Big Beautiful Bill") reducing business license tax revenue by an estimated $21.4 million in the current fiscal year, though this was partially offset by a state partial federal disconnect providing $5.3 million relief for next year. The session's second half featured each councilor outlining their budget priorities and acceptable versus unacceptable cuts to Mayor Keith Wilson. The tone was collaborative but serious, with councilors acknowledging the difficult financial reality while establishing clear red lines around voter-approved programs like the parks levy, public safety services, and prevention programs.</w:t>
       </w:r>
     </w:p>
     <w:p>
@@ -206,7 +206,7 @@
           <w:color w:val="404040"/>
           <w:sz w:val="20"/>
         </w:rPr>
-        <w:t>The committee successfully passed both ordinances with amendments after robust discussion about program administration, funding thresholds, and strategic priorities. Multiple councilors proposed amendments reflecting different approaches to implementation, with Elana Pirtle-Guiney (District 2) successfully advocating for lowered unit minimums and expanded income targeting. Steve Novick (District 3) proposed more substantial restructuring that did not gain support, while Mitch Green (District 4) raised governance concerns about delegating program oversight to Prosper Portland. The overall tone was collaborative but urgent, with broad agreement on the need to deploy housing resources quickly while maintaining accountability and strategic focus.</w:t>
+        <w:t>Mayor Keith Wilson opened the priority discussion by emphasizing this is a "reset moment" requiring meaningful sacrifices, urging councilors to propose specific cuts rather than just protect programs. Councilors consistently emphasized targeted rather than across-the-board cuts, with strong support for maintaining parks services (given voter approval of the parks levy), public safety personnel levels, and violence prevention programs. There was notable consensus around examining administrative overhead, reducing external contracts, and scrutinizing grant programs to nonprofits funded by general fund dollars.</w:t>
       </w:r>
     </w:p>
     <w:p>
@@ -221,51 +221,12 @@
       </w:r>
     </w:p>
     <w:p>
-      <w:pPr>
-        <w:pStyle w:val="ListBullet"/>
-      </w:pPr>
       <w:r>
         <w:rPr>
           <w:color w:val="404040"/>
           <w:sz w:val="20"/>
         </w:rPr>
-        <w:t>Moderate Income Revolving Loan Program ordinance: Passed as amended 4-1 with amendments lowering minimum unit threshold from 75 to 20 units, expanding income eligibility from 60-120% to 50-120% AMI, and removing mixed-use development requirements. Mitch Green (District 4) voted no due to concerns about program administration and oversight [00:49:10]</w:t>
-      </w:r>
-    </w:p>
-    <w:p>
-      <w:pPr>
-        <w:pStyle w:val="ListBullet"/>
-      </w:pPr>
-      <w:r>
-        <w:rPr>
-          <w:color w:val="404040"/>
-          <w:sz w:val="20"/>
-        </w:rPr>
-        <w:t>Portland Housing Bureau supplemental budget ordinance ($56 million allocation): Advanced to full council with multiple amendments pending further discussion. The package includes $9 million for rent assistance, $8.8 million for debt buydowns, $10 million for social housing acquisition, and various other housing stability investments [01:00:00]</w:t>
-      </w:r>
-    </w:p>
-    <w:p>
-      <w:pPr>
-        <w:pStyle w:val="ListBullet"/>
-      </w:pPr>
-      <w:r>
-        <w:rPr>
-          <w:color w:val="404040"/>
-          <w:sz w:val="20"/>
-        </w:rPr>
-        <w:t>Rejected amendment (Green 1): Failed 2-3, which would have transferred program administration from Prosper Portland to Portland Housing Bureau and made other structural changes [00:45:15]</w:t>
-      </w:r>
-    </w:p>
-    <w:p>
-      <w:pPr>
-        <w:pStyle w:val="ListBullet"/>
-      </w:pPr>
-      <w:r>
-        <w:rPr>
-          <w:color w:val="404040"/>
-          <w:sz w:val="20"/>
-        </w:rPr>
-        <w:t>Approved amendment (Pirtle-Guiney 1): Passed 5-0, modifying MIRL program eligibility and unit minimums [00:48:00]</w:t>
+        <w:t>No formal votes recorded this session.</w:t>
       </w:r>
     </w:p>
     <w:p>
@@ -285,7 +246,20 @@
           <w:color w:val="404040"/>
           <w:sz w:val="20"/>
         </w:rPr>
-        <w:t>Real Estate &amp; Housing</w:t>
+      </w:r>
+      <w:r>
+        <w:rPr>
+          <w:b/>
+          <w:color w:val="404040"/>
+          <w:sz w:val="20"/>
+        </w:rPr>
+        <w:t>City Budget &amp; Finance</w:t>
+      </w:r>
+      <w:r>
+        <w:rPr>
+          <w:color w:val="404040"/>
+          <w:sz w:val="20"/>
+        </w:rPr>
       </w:r>
     </w:p>
     <w:p>
@@ -294,7 +268,7 @@
           <w:color w:val="404040"/>
           <w:sz w:val="20"/>
         </w:rPr>
-        <w:t>Extensive discussion of two major housing finance tools and funding allocations. Andrea Jacob from Bureau of Planning and Sustainability and Sarah Harpole from Prosper Portland presented the MIRL program, which leverages tax increment financing and fee-in-lieu mechanisms to support moderate-income housing development [00:11:09]. The $56 million supplemental budget represents a comprehensive approach to housing stability, with significant debate over social housing acquisition versus traditional affordable housing development. Robert Pyle from Oak Leaf Redevelopment testified about removing unit minimums to enable more missing middle housing projects [00:21:38]. This has major implications for Portland's housing production strategy and could significantly impact multifamily development patterns.</w:t>
+        <w:t>The primary focus was the March 2026 forecast update showing the city faces a $50.1 million budget gap requiring $35.6 million in ongoing cuts and $15.1 million in one-time cuts [00:18:30]. City Economist Peter Holzman explained that House Resolution 1 reduced business license tax revenue by $21.4 million in the current fiscal year, though a state partial federal disconnect will provide $5.3 million relief next year. The forecast remains balanced over five years under Current Appropriation Level (CAL) assumptions, but Current Service Level needs are typically higher, creating additional pressure. Mayor Keith Wilson announced he's developing a 5-year financial stabilization plan. Multiple councilors emphasized the need for targeted rather than across-the-board cuts, with significant discussion about administrative efficiency and span of control issues. This directly impacts development through potential changes to permitting staffing and System Development Charges.</w:t>
       </w:r>
     </w:p>
     <w:p>
@@ -303,7 +277,20 @@
           <w:color w:val="404040"/>
           <w:sz w:val="20"/>
         </w:rPr>
-        <w:t>System Development Charges (SDCs) &amp; Permitting Fees</w:t>
+      </w:r>
+      <w:r>
+        <w:rPr>
+          <w:b/>
+          <w:color w:val="404040"/>
+          <w:sz w:val="20"/>
+        </w:rPr>
+        <w:t>Real Estate &amp; Housing</w:t>
+      </w:r>
+      <w:r>
+        <w:rPr>
+          <w:color w:val="404040"/>
+          <w:sz w:val="20"/>
+        </w:rPr>
       </w:r>
     </w:p>
     <w:p>
@@ -312,7 +299,7 @@
           <w:color w:val="404040"/>
           <w:sz w:val="20"/>
         </w:rPr>
-        <w:t>The supplemental budget includes $10.7 million in Construction Excise Tax funds being reallocated for housing purposes [00:50:49]. Multiple testifiers discussed the need for fee waivers and streamlined permitting to support affordable housing development. The MIRL program specifically addresses financing gaps that prevent penciling out of larger multifamily projects due to regulatory costs and market conditions [00:13:02]. These discussions directly impact development feasibility and SDC policy framework.</w:t>
+        <w:t>Councilor Loretta Smith (District 1) asked about $7.8 million expected from the Ritz Agreement related to inclusionary housing in-lieu fees [01:05:39]. Housing Bureau Interim Director Michael Bonacourt confirmed negotiations are ongoing and any finalized amount would be added through a Technical Adjustment Ordinance. Councilor Jamie Dunphy (District 1) emphasized the importance of not cutting Planning &amp; Development (PP&amp;D) staff or permitting capacity, warning that reduced staffing would undermine efforts to signal the city is "open for business" to developers. The discussion highlighted revenue uncertainty while emphasizing the need to maintain development processing capacity.</w:t>
       </w:r>
     </w:p>
     <w:p>
@@ -321,7 +308,20 @@
           <w:color w:val="404040"/>
           <w:sz w:val="20"/>
         </w:rPr>
-        <w:t>City Budget &amp; Finance</w:t>
+      </w:r>
+      <w:r>
+        <w:rPr>
+          <w:b/>
+          <w:color w:val="404040"/>
+          <w:sz w:val="20"/>
+        </w:rPr>
+        <w:t>System Development Charges (SDCs) &amp; Permitting Fees</w:t>
+      </w:r>
+      <w:r>
+        <w:rPr>
+          <w:color w:val="404040"/>
+          <w:sz w:val="20"/>
+        </w:rPr>
       </w:r>
     </w:p>
     <w:p>
@@ -330,7 +330,7 @@
           <w:color w:val="404040"/>
           <w:sz w:val="20"/>
         </w:rPr>
-        <w:t>Major focus on $56 million in previously unallocated housing funds across multiple revenue streams including Rental Services Office funds ($20.7M), Short-Term Rental Tax ($19.7M), and River District TIF ($4.8M) [00:50:49]. Significant debate over returning $4 million to general fund versus maintaining all resources for housing purposes. Multiple councilors and testifiers opposed general fund allocation, arguing housing dollars should remain dedicated to housing crisis response [01:19:15]. Financial sustainability of affordable housing operations was major theme, with providers describing increasing costs for serving high-acuity populations.</w:t>
+        <w:t>Council President Jamie Dunphy (District 1) specifically cautioned against cutting PP&amp;D permitting and development staff, noting that while these positions aren't general fund supported, they depend on fee collections tied to development activity [01:55:00]. He emphasized ensuring adequate staffing exists to process applications when the private sector brings development projects forward, linking this to broader economic development messaging that Portland is ready for business.</w:t>
       </w:r>
     </w:p>
     <w:p>
@@ -339,7 +339,20 @@
           <w:color w:val="404040"/>
           <w:sz w:val="20"/>
         </w:rPr>
-        <w:t>Land Use &amp; Zoning</w:t>
+      </w:r>
+      <w:r>
+        <w:rPr>
+          <w:b/>
+          <w:color w:val="404040"/>
+          <w:sz w:val="20"/>
+        </w:rPr>
+        <w:t>Homelessness &amp; Shelter Policy</w:t>
+      </w:r>
+      <w:r>
+        <w:rPr>
+          <w:color w:val="404040"/>
+          <w:sz w:val="20"/>
+        </w:rPr>
       </w:r>
     </w:p>
     <w:p>
@@ -348,7 +361,7 @@
           <w:color w:val="404040"/>
           <w:sz w:val="20"/>
         </w:rPr>
-        <w:t>MIRL program specifically targets higher-density multifamily housing development near transit corridors [00:13:53]. Discussion of geographic targeting across different districts and TIF zones, with examples of potential projects in Lents, Interstate, Lloyd, 82nd Avenue, and Westside districts [00:16:59]. Social housing acquisition component could remove properties from speculative market permanently, representing significant land use policy shift toward public ownership models.</w:t>
+        <w:t>Significant discussion centered on Mayor Keith Wilson's proposed overnight shelter program and the Impact Reduction Program (IRP). Councilor Mitch Green (District 4) stated he won't support the same level of shelter capacity as previously proposed, suggesting the 1,500-bed capacity is too expensive [01:36:00]. Multiple councilors, including Councilor Jamie Dunphy (District 1), indicated they cannot support overnight shelters if it requires laying off city employees. Councilor Steve Novick (District 3) and others expressed concerns about IRP costs while acknowledging legal requirements for minimum campsite clearance activities. This impacts development through potential effects on neighborhood conditions and public space management affecting project feasibility and community acceptance.</w:t>
       </w:r>
     </w:p>
     <w:p>
@@ -357,7 +370,20 @@
           <w:color w:val="404040"/>
           <w:sz w:val="20"/>
         </w:rPr>
-        <w:t>Homelessness &amp; Shelter Policy</w:t>
+      </w:r>
+      <w:r>
+        <w:rPr>
+          <w:b/>
+          <w:color w:val="404040"/>
+          <w:sz w:val="20"/>
+        </w:rPr>
+        <w:t>Public Safety</w:t>
+      </w:r>
+      <w:r>
+        <w:rPr>
+          <w:color w:val="404040"/>
+          <w:sz w:val="20"/>
+        </w:rPr>
       </w:r>
     </w:p>
     <w:p>
@@ -366,7 +392,69 @@
           <w:color w:val="404040"/>
           <w:sz w:val="20"/>
         </w:rPr>
-        <w:t>Substantial testimony about preventing inflow into homelessness through eviction prevention, with data showing 300 people monthly entering homelessness in Multnomah County [00:54:34]. Andy Miller from Our Just Future highlighted risk of 600 occupied shelter beds closing due to budget cuts [01:28:45]. Multiple service providers testified about rent assistance effectiveness, with average eviction amounts around $3,000 according to Oregon Law Center [01:36:15].</w:t>
+        <w:t>Strong consensus emerged around maintaining police staffing levels and preserving community violence prevention programs. Councilor Olivia Clark (District 4) established a "red line" against cutting police officer positions, citing existing understaffing [01:56:30]. Multiple councilors emphasized protecting programs like Ceasefire, Portland Street Response, and Public Safety Specialists as cost-effective alternatives that reduce long-term public safety costs. Councilor Steve Novick (District 3) expressed concern about potential fire station closures while acknowledging difficult choices ahead. These decisions affect development by influencing neighborhood safety perceptions and emergency response capabilities that factor into project planning.</w:t>
+      </w:r>
+    </w:p>
+    <w:p>
+      <w:r>
+        <w:rPr>
+          <w:color w:val="404040"/>
+          <w:sz w:val="20"/>
+        </w:rPr>
+      </w:r>
+      <w:r>
+        <w:rPr>
+          <w:b/>
+          <w:color w:val="404040"/>
+          <w:sz w:val="20"/>
+        </w:rPr>
+        <w:t>Infrastructure &amp; Transportation</w:t>
+      </w:r>
+      <w:r>
+        <w:rPr>
+          <w:color w:val="404040"/>
+          <w:sz w:val="20"/>
+        </w:rPr>
+      </w:r>
+    </w:p>
+    <w:p>
+      <w:r>
+        <w:rPr>
+          <w:color w:val="404040"/>
+          <w:sz w:val="20"/>
+        </w:rPr>
+        <w:t>Council President Jamie Dunphy (District 1) noted that the Bureau of Transportation applies cost multipliers for maintenance in East Portland due to distance from maintenance facilities, expressing concern about disproportionate impacts of cuts on outer neighborhoods [01:55:00]. He emphasized ensuring aggregate budget reduction effects don't disproportionately impact East Portland, which already receives fewer infrastructure investments. This affects development patterns and infrastructure capacity supporting new projects.</w:t>
+      </w:r>
+    </w:p>
+    <w:p>
+      <w:r>
+        <w:rPr>
+          <w:color w:val="404040"/>
+          <w:sz w:val="20"/>
+        </w:rPr>
+      </w:r>
+      <w:r>
+        <w:rPr>
+          <w:b/>
+          <w:color w:val="404040"/>
+          <w:sz w:val="20"/>
+        </w:rPr>
+        <w:t>Economic Development</w:t>
+      </w:r>
+      <w:r>
+        <w:rPr>
+          <w:color w:val="404040"/>
+          <w:sz w:val="20"/>
+        </w:rPr>
+      </w:r>
+    </w:p>
+    <w:p>
+      <w:r>
+        <w:rPr>
+          <w:color w:val="404040"/>
+          <w:sz w:val="20"/>
+        </w:rPr>
+        <w:t>Discussion of transient lodging tax revenue decline highlighted tourism and convention challenges. Councilor Sameer Kanal (District 2) noted convention center bookings as a key indicator, with current low performance reflecting events booked 2-3 years ago during the pandemic [00:52:00]. The forecast shows $1 million reduction in transient lodging tax projections. Councilor Mitch Green (District 4) raised concerns about rising jet fuel costs potentially further impacting tourism. Multiple councilors discussed the Office of Arts and Culture as economic development infrastructure. These trends affect hospitality development viability and broader economic development projects.</w:t>
       </w:r>
     </w:p>
     <w:p>
@@ -389,7 +477,7 @@
           <w:color w:val="404040"/>
           <w:sz w:val="20"/>
         </w:rPr>
-        <w:t>Both ordinances will be presented to full Portland City Council as amendments to the Technical Adjustment Ordinance (TAO) following this committee session</w:t>
+        <w:t>Mayor Keith Wilson will release proposed budget with specific cut proposals for council consideration</w:t>
       </w:r>
     </w:p>
     <w:p>
@@ -401,7 +489,7 @@
           <w:color w:val="404040"/>
           <w:sz w:val="20"/>
         </w:rPr>
-        <w:t>Master agreements required between OHCS, City, and County for MIRL program implementation before fall 2026 launch [00:18:14]</w:t>
+        <w:t>City Economist Peter Holzman will provide business license tax revenue update in early May if collections significantly exceed or fall below expectations</w:t>
       </w:r>
     </w:p>
     <w:p>
@@ -413,7 +501,7 @@
           <w:color w:val="404040"/>
           <w:sz w:val="20"/>
         </w:rPr>
-        <w:t>Continued discussion needed on MIRL program administration structure and oversight mechanisms before full council vote</w:t>
+        <w:t>Potential Technical Adjustment Ordinance for Ritz Agreement proceeds once housing bureau negotiations conclude</w:t>
       </w:r>
     </w:p>
     <w:p>
@@ -425,7 +513,7 @@
           <w:color w:val="404040"/>
           <w:sz w:val="20"/>
         </w:rPr>
-        <w:t>Future Notice of Funding Availability (NOFA) for $12.6 million in housing development funds to be developed</w:t>
+        <w:t>Mayor Keith Wilson's 5-year financial stabilization and recovery plan development over the next couple of months and summer</w:t>
       </w:r>
     </w:p>
     <w:p>
@@ -437,7 +525,19 @@
           <w:color w:val="404040"/>
           <w:sz w:val="20"/>
         </w:rPr>
-        <w:t>Geographic equity analysis needed for rent assistance distribution, particularly for East Portland investments</w:t>
+        <w:t>Council amendments to mayor's proposed budget based on priorities expressed in this session</w:t>
+      </w:r>
+    </w:p>
+    <w:p>
+      <w:pPr>
+        <w:pStyle w:val="ListBullet"/>
+      </w:pPr>
+      <w:r>
+        <w:rPr>
+          <w:color w:val="404040"/>
+          <w:sz w:val="20"/>
+        </w:rPr>
+        <w:t>Follow-up meeting between Councilor Loretta Smith (District 1), City Administrator, and District Coalition offices regarding neighborhood association funding and structure concerns</w:t>
       </w:r>
     </w:p>
     <w:sectPr>

</xml_diff>